<commit_message>
GDTC 1–5: đồng bộ theo app bản 170 — cột 7 chép từ giáo án, lớp 1 số tiết cả bài, lớp 4 bỏ tiền tố dòng 1 (website + web-chung sinh lại)
Co-Authored-By: Claude Fable 5.1 <noreply@anthropic.com>
</commit_message>
<xml_diff>
--- a/assets/docs/lop1/Giao duc the chat - Lop 1.docx
+++ b/assets/docs/lop1/Giao duc the chat - Lop 1.docx
@@ -605,7 +605,7 @@
                 <w:i w:val="0"/>
                 <w:sz w:val="20"/>
               </w:rPr>
-              <w:t>Tiết 1 (1 tiết)</w:t>
+              <w:t>Tiết 1 (3 tiết)</w:t>
             </w:r>
           </w:p>
         </w:tc>
@@ -733,7 +733,7 @@
                 <w:i w:val="0"/>
                 <w:sz w:val="20"/>
               </w:rPr>
-              <w:t>Tiết 2 (1 tiết)</w:t>
+              <w:t>Tiết 2 (3 tiết)</w:t>
             </w:r>
           </w:p>
         </w:tc>
@@ -850,7 +850,7 @@
                 <w:i w:val="0"/>
                 <w:sz w:val="20"/>
               </w:rPr>
-              <w:t>Tiết 3 (1 tiết)</w:t>
+              <w:t>Tiết 3 (3 tiết)</w:t>
             </w:r>
           </w:p>
         </w:tc>
@@ -965,7 +965,7 @@
                 <w:i w:val="0"/>
                 <w:sz w:val="20"/>
               </w:rPr>
-              <w:t>Tiết 4 (1 tiết)</w:t>
+              <w:t>Tiết 4 (4 tiết)</w:t>
             </w:r>
           </w:p>
         </w:tc>
@@ -1095,7 +1095,7 @@
                 <w:i w:val="0"/>
                 <w:sz w:val="20"/>
               </w:rPr>
-              <w:t>Tiết 5 (1 tiết)</w:t>
+              <w:t>Tiết 5 (4 tiết)</w:t>
             </w:r>
           </w:p>
         </w:tc>
@@ -1210,7 +1210,7 @@
                 <w:i w:val="0"/>
                 <w:sz w:val="20"/>
               </w:rPr>
-              <w:t>Tiết 6 (1 tiết)</w:t>
+              <w:t>Tiết 6 (4 tiết)</w:t>
             </w:r>
           </w:p>
         </w:tc>
@@ -1340,7 +1340,7 @@
                 <w:i w:val="0"/>
                 <w:sz w:val="20"/>
               </w:rPr>
-              <w:t>Tiết 7 (1 tiết)</w:t>
+              <w:t>Tiết 7 (4 tiết)</w:t>
             </w:r>
           </w:p>
         </w:tc>
@@ -1455,7 +1455,7 @@
                 <w:i w:val="0"/>
                 <w:sz w:val="20"/>
               </w:rPr>
-              <w:t>Tiết 8 (1 tiết)</w:t>
+              <w:t>Tiết 8 (4 tiết)</w:t>
             </w:r>
           </w:p>
         </w:tc>
@@ -1585,7 +1585,7 @@
                 <w:i w:val="0"/>
                 <w:sz w:val="20"/>
               </w:rPr>
-              <w:t>Tiết 9 (1 tiết)</w:t>
+              <w:t>Tiết 9 (4 tiết)</w:t>
             </w:r>
           </w:p>
         </w:tc>
@@ -1700,7 +1700,7 @@
                 <w:i w:val="0"/>
                 <w:sz w:val="20"/>
               </w:rPr>
-              <w:t>Tiết 10 (1 tiết)</w:t>
+              <w:t>Tiết 10 (4 tiết)</w:t>
             </w:r>
           </w:p>
         </w:tc>
@@ -1830,7 +1830,7 @@
                 <w:i w:val="0"/>
                 <w:sz w:val="20"/>
               </w:rPr>
-              <w:t>Tiết 11 (1 tiết)</w:t>
+              <w:t>Tiết 11 (4 tiết)</w:t>
             </w:r>
           </w:p>
         </w:tc>
@@ -1945,7 +1945,7 @@
                 <w:i w:val="0"/>
                 <w:sz w:val="20"/>
               </w:rPr>
-              <w:t>Tiết 12 (1 tiết)</w:t>
+              <w:t>Tiết 12 (3 tiết)</w:t>
             </w:r>
           </w:p>
         </w:tc>
@@ -2075,7 +2075,7 @@
                 <w:i w:val="0"/>
                 <w:sz w:val="20"/>
               </w:rPr>
-              <w:t>Tiết 13 (1 tiết)</w:t>
+              <w:t>Tiết 13 (3 tiết)</w:t>
             </w:r>
           </w:p>
         </w:tc>
@@ -2190,7 +2190,7 @@
                 <w:i w:val="0"/>
                 <w:sz w:val="20"/>
               </w:rPr>
-              <w:t>Tiết 14 (1 tiết)</w:t>
+              <w:t>Tiết 14 (3 tiết)</w:t>
             </w:r>
           </w:p>
         </w:tc>
@@ -2307,7 +2307,7 @@
                 <w:i w:val="0"/>
                 <w:sz w:val="20"/>
               </w:rPr>
-              <w:t>Tiết 15 (1 tiết)</w:t>
+              <w:t>Tiết 15 (2 tiết)</w:t>
             </w:r>
           </w:p>
         </w:tc>
@@ -2422,7 +2422,7 @@
                 <w:i w:val="0"/>
                 <w:sz w:val="20"/>
               </w:rPr>
-              <w:t>Tiết 16 (1 tiết)</w:t>
+              <w:t>Tiết 16 (2 tiết)</w:t>
             </w:r>
           </w:p>
         </w:tc>
@@ -2538,7 +2538,7 @@
                 <w:i w:val="0"/>
                 <w:sz w:val="20"/>
               </w:rPr>
-              <w:t>Tiết 17 (1 tiết)</w:t>
+              <w:t>Tiết 17 (3 tiết)</w:t>
             </w:r>
           </w:p>
         </w:tc>
@@ -2653,7 +2653,7 @@
                 <w:i w:val="0"/>
                 <w:sz w:val="20"/>
               </w:rPr>
-              <w:t>Tiết 18 (1 tiết)</w:t>
+              <w:t>Tiết 18 (3 tiết)</w:t>
             </w:r>
           </w:p>
         </w:tc>
@@ -2769,7 +2769,7 @@
                 <w:i w:val="0"/>
                 <w:sz w:val="20"/>
               </w:rPr>
-              <w:t>Tiết 19 (1 tiết)</w:t>
+              <w:t>Tiết 19 (3 tiết)</w:t>
             </w:r>
           </w:p>
         </w:tc>
@@ -2884,7 +2884,7 @@
                 <w:i w:val="0"/>
                 <w:sz w:val="20"/>
               </w:rPr>
-              <w:t>Tiết 20 (1 tiết)</w:t>
+              <w:t>Tiết 20 (2 tiết)</w:t>
             </w:r>
           </w:p>
         </w:tc>
@@ -3001,7 +3001,7 @@
                 <w:i w:val="0"/>
                 <w:sz w:val="20"/>
               </w:rPr>
-              <w:t>Tiết 21 (1 tiết)</w:t>
+              <w:t>Tiết 21 (2 tiết)</w:t>
             </w:r>
           </w:p>
         </w:tc>
@@ -3233,7 +3233,7 @@
                 <w:i w:val="0"/>
                 <w:sz w:val="20"/>
               </w:rPr>
-              <w:t>Tiết 23 (1 tiết)</w:t>
+              <w:t>Tiết 23 (3 tiết)</w:t>
             </w:r>
           </w:p>
         </w:tc>
@@ -3361,7 +3361,7 @@
                 <w:i w:val="0"/>
                 <w:sz w:val="20"/>
               </w:rPr>
-              <w:t>Tiết 24 (1 tiết)</w:t>
+              <w:t>Tiết 24 (3 tiết)</w:t>
             </w:r>
           </w:p>
         </w:tc>
@@ -3478,7 +3478,7 @@
                 <w:i w:val="0"/>
                 <w:sz w:val="20"/>
               </w:rPr>
-              <w:t>Tiết 25 (1 tiết)</w:t>
+              <w:t>Tiết 25 (3 tiết)</w:t>
             </w:r>
           </w:p>
         </w:tc>
@@ -3593,7 +3593,7 @@
                 <w:i w:val="0"/>
                 <w:sz w:val="20"/>
               </w:rPr>
-              <w:t>Tiết 26 (1 tiết)</w:t>
+              <w:t>Tiết 26 (4 tiết)</w:t>
             </w:r>
           </w:p>
         </w:tc>
@@ -3723,7 +3723,7 @@
                 <w:i w:val="0"/>
                 <w:sz w:val="20"/>
               </w:rPr>
-              <w:t>Tiết 27 (1 tiết)</w:t>
+              <w:t>Tiết 27 (4 tiết)</w:t>
             </w:r>
           </w:p>
         </w:tc>
@@ -3838,7 +3838,7 @@
                 <w:i w:val="0"/>
                 <w:sz w:val="20"/>
               </w:rPr>
-              <w:t>Tiết 28 (1 tiết)</w:t>
+              <w:t>Tiết 28 (4 tiết)</w:t>
             </w:r>
           </w:p>
         </w:tc>
@@ -3968,7 +3968,7 @@
                 <w:i w:val="0"/>
                 <w:sz w:val="20"/>
               </w:rPr>
-              <w:t>Tiết 29 (1 tiết)</w:t>
+              <w:t>Tiết 29 (4 tiết)</w:t>
             </w:r>
           </w:p>
         </w:tc>
@@ -4083,7 +4083,7 @@
                 <w:i w:val="0"/>
                 <w:sz w:val="20"/>
               </w:rPr>
-              <w:t>Tiết 30 (1 tiết)</w:t>
+              <w:t>Tiết 30 (5 tiết)</w:t>
             </w:r>
           </w:p>
         </w:tc>
@@ -4213,7 +4213,7 @@
                 <w:i w:val="0"/>
                 <w:sz w:val="20"/>
               </w:rPr>
-              <w:t>Tiết 31 (1 tiết)</w:t>
+              <w:t>Tiết 31 (5 tiết)</w:t>
             </w:r>
           </w:p>
         </w:tc>
@@ -4328,7 +4328,7 @@
                 <w:i w:val="0"/>
                 <w:sz w:val="20"/>
               </w:rPr>
-              <w:t>Tiết 32 (1 tiết)</w:t>
+              <w:t>Tiết 32 (5 tiết)</w:t>
             </w:r>
           </w:p>
         </w:tc>
@@ -4458,7 +4458,7 @@
                 <w:i w:val="0"/>
                 <w:sz w:val="20"/>
               </w:rPr>
-              <w:t>Tiết 33 (1 tiết)</w:t>
+              <w:t>Tiết 33 (5 tiết)</w:t>
             </w:r>
           </w:p>
         </w:tc>
@@ -4573,7 +4573,7 @@
                 <w:i w:val="0"/>
                 <w:sz w:val="20"/>
               </w:rPr>
-              <w:t>Tiết 34 (1 tiết)</w:t>
+              <w:t>Tiết 34 (5 tiết)</w:t>
             </w:r>
           </w:p>
         </w:tc>
@@ -4945,7 +4945,7 @@
                 <w:i w:val="0"/>
                 <w:sz w:val="20"/>
               </w:rPr>
-              <w:t>Tiết 37 (1 tiết)</w:t>
+              <w:t>Tiết 37 (6 tiết)</w:t>
             </w:r>
           </w:p>
         </w:tc>
@@ -5073,7 +5073,7 @@
                 <w:i w:val="0"/>
                 <w:sz w:val="20"/>
               </w:rPr>
-              <w:t>Tiết 38 (1 tiết)</w:t>
+              <w:t>Tiết 38 (6 tiết)</w:t>
             </w:r>
           </w:p>
         </w:tc>
@@ -5190,7 +5190,7 @@
                 <w:i w:val="0"/>
                 <w:sz w:val="20"/>
               </w:rPr>
-              <w:t>Tiết 39 (1 tiết)</w:t>
+              <w:t>Tiết 39 (6 tiết)</w:t>
             </w:r>
           </w:p>
         </w:tc>
@@ -5318,7 +5318,7 @@
                 <w:i w:val="0"/>
                 <w:sz w:val="20"/>
               </w:rPr>
-              <w:t>Tiết 40 (1 tiết)</w:t>
+              <w:t>Tiết 40 (6 tiết)</w:t>
             </w:r>
           </w:p>
         </w:tc>
@@ -5435,7 +5435,7 @@
                 <w:i w:val="0"/>
                 <w:sz w:val="20"/>
               </w:rPr>
-              <w:t>Tiết 41 (1 tiết)</w:t>
+              <w:t>Tiết 41 (6 tiết)</w:t>
             </w:r>
           </w:p>
         </w:tc>
@@ -5563,7 +5563,7 @@
                 <w:i w:val="0"/>
                 <w:sz w:val="20"/>
               </w:rPr>
-              <w:t>Tiết 42 (1 tiết)</w:t>
+              <w:t>Tiết 42 (6 tiết)</w:t>
             </w:r>
           </w:p>
         </w:tc>
@@ -5680,7 +5680,7 @@
                 <w:i w:val="0"/>
                 <w:sz w:val="20"/>
               </w:rPr>
-              <w:t>Tiết 43 (1 tiết)</w:t>
+              <w:t>Tiết 43 (6 tiết)</w:t>
             </w:r>
           </w:p>
         </w:tc>
@@ -5808,7 +5808,7 @@
                 <w:i w:val="0"/>
                 <w:sz w:val="20"/>
               </w:rPr>
-              <w:t>Tiết 44 (1 tiết)</w:t>
+              <w:t>Tiết 44 (6 tiết)</w:t>
             </w:r>
           </w:p>
         </w:tc>
@@ -5925,7 +5925,7 @@
                 <w:i w:val="0"/>
                 <w:sz w:val="20"/>
               </w:rPr>
-              <w:t>Tiết 45 (1 tiết)</w:t>
+              <w:t>Tiết 45 (6 tiết)</w:t>
             </w:r>
           </w:p>
         </w:tc>
@@ -6053,7 +6053,7 @@
                 <w:i w:val="0"/>
                 <w:sz w:val="20"/>
               </w:rPr>
-              <w:t>Tiết 46 (1 tiết)</w:t>
+              <w:t>Tiết 46 (6 tiết)</w:t>
             </w:r>
           </w:p>
         </w:tc>
@@ -6170,7 +6170,7 @@
                 <w:i w:val="0"/>
                 <w:sz w:val="20"/>
               </w:rPr>
-              <w:t>Tiết 47 (1 tiết)</w:t>
+              <w:t>Tiết 47 (6 tiết)</w:t>
             </w:r>
           </w:p>
         </w:tc>
@@ -6298,7 +6298,7 @@
                 <w:i w:val="0"/>
                 <w:sz w:val="20"/>
               </w:rPr>
-              <w:t>Tiết 48 (1 tiết)</w:t>
+              <w:t>Tiết 48 (6 tiết)</w:t>
             </w:r>
           </w:p>
         </w:tc>
@@ -6415,7 +6415,7 @@
                 <w:i w:val="0"/>
                 <w:sz w:val="20"/>
               </w:rPr>
-              <w:t>Tiết 49 (1 tiết)</w:t>
+              <w:t>Tiết 49 (4 tiết)</w:t>
             </w:r>
           </w:p>
         </w:tc>
@@ -6530,7 +6530,7 @@
                 <w:i w:val="0"/>
                 <w:sz w:val="20"/>
               </w:rPr>
-              <w:t>Tiết 50 (1 tiết)</w:t>
+              <w:t>Tiết 50 (4 tiết)</w:t>
             </w:r>
           </w:p>
         </w:tc>
@@ -6646,7 +6646,7 @@
                 <w:i w:val="0"/>
                 <w:sz w:val="20"/>
               </w:rPr>
-              <w:t>Tiết 51 (1 tiết)</w:t>
+              <w:t>Tiết 51 (4 tiết)</w:t>
             </w:r>
           </w:p>
         </w:tc>
@@ -6760,7 +6760,7 @@
                 <w:i w:val="0"/>
                 <w:sz w:val="20"/>
               </w:rPr>
-              <w:t>Tiết 52 (1 tiết)</w:t>
+              <w:t>Tiết 52 (4 tiết)</w:t>
             </w:r>
           </w:p>
         </w:tc>
@@ -6877,7 +6877,7 @@
                 <w:i w:val="0"/>
                 <w:sz w:val="20"/>
               </w:rPr>
-              <w:t>Tiết 53 (1 tiết)</w:t>
+              <w:t>Tiết 53 (4 tiết)</w:t>
             </w:r>
           </w:p>
         </w:tc>
@@ -6992,7 +6992,7 @@
                 <w:i w:val="0"/>
                 <w:sz w:val="20"/>
               </w:rPr>
-              <w:t>Tiết 54 (1 tiết)</w:t>
+              <w:t>Tiết 54 (4 tiết)</w:t>
             </w:r>
           </w:p>
         </w:tc>
@@ -7108,7 +7108,7 @@
                 <w:i w:val="0"/>
                 <w:sz w:val="20"/>
               </w:rPr>
-              <w:t>Tiết 55 (1 tiết)</w:t>
+              <w:t>Tiết 55 (4 tiết)</w:t>
             </w:r>
           </w:p>
         </w:tc>
@@ -7222,7 +7222,7 @@
                 <w:i w:val="0"/>
                 <w:sz w:val="20"/>
               </w:rPr>
-              <w:t>Tiết 56 (1 tiết)</w:t>
+              <w:t>Tiết 56 (4 tiết)</w:t>
             </w:r>
           </w:p>
         </w:tc>
@@ -7455,7 +7455,7 @@
                 <w:i w:val="0"/>
                 <w:sz w:val="20"/>
               </w:rPr>
-              <w:t>Tiết 58 (1 tiết)</w:t>
+              <w:t>Tiết 58 (5 tiết)</w:t>
             </w:r>
           </w:p>
         </w:tc>
@@ -7572,7 +7572,7 @@
                 <w:i w:val="0"/>
                 <w:sz w:val="20"/>
               </w:rPr>
-              <w:t>Tiết 59 (1 tiết)</w:t>
+              <w:t>Tiết 59 (5 tiết)</w:t>
             </w:r>
           </w:p>
         </w:tc>
@@ -7686,7 +7686,7 @@
                 <w:i w:val="0"/>
                 <w:sz w:val="20"/>
               </w:rPr>
-              <w:t>Tiết 60 (1 tiết)</w:t>
+              <w:t>Tiết 60 (5 tiết)</w:t>
             </w:r>
           </w:p>
         </w:tc>
@@ -7802,7 +7802,7 @@
                 <w:i w:val="0"/>
                 <w:sz w:val="20"/>
               </w:rPr>
-              <w:t>Tiết 61 (1 tiết)</w:t>
+              <w:t>Tiết 61 (5 tiết)</w:t>
             </w:r>
           </w:p>
         </w:tc>
@@ -7917,7 +7917,7 @@
                 <w:i w:val="0"/>
                 <w:sz w:val="20"/>
               </w:rPr>
-              <w:t>Tiết 62 (1 tiết)</w:t>
+              <w:t>Tiết 62 (5 tiết)</w:t>
             </w:r>
           </w:p>
         </w:tc>
@@ -8033,7 +8033,7 @@
                 <w:i w:val="0"/>
                 <w:sz w:val="20"/>
               </w:rPr>
-              <w:t>Tiết 63 (1 tiết)</w:t>
+              <w:t>Tiết 63 (5 tiết)</w:t>
             </w:r>
           </w:p>
         </w:tc>
@@ -8148,7 +8148,7 @@
                 <w:i w:val="0"/>
                 <w:sz w:val="20"/>
               </w:rPr>
-              <w:t>Tiết 64 (1 tiết)</w:t>
+              <w:t>Tiết 64 (5 tiết)</w:t>
             </w:r>
           </w:p>
         </w:tc>
@@ -8264,7 +8264,7 @@
                 <w:i w:val="0"/>
                 <w:sz w:val="20"/>
               </w:rPr>
-              <w:t>Tiết 65 (1 tiết)</w:t>
+              <w:t>Tiết 65 (5 tiết)</w:t>
             </w:r>
           </w:p>
         </w:tc>
@@ -8378,7 +8378,7 @@
                 <w:i w:val="0"/>
                 <w:sz w:val="20"/>
               </w:rPr>
-              <w:t>Tiết 66 (1 tiết)</w:t>
+              <w:t>Tiết 66 (5 tiết)</w:t>
             </w:r>
           </w:p>
         </w:tc>
@@ -8495,7 +8495,7 @@
                 <w:i w:val="0"/>
                 <w:sz w:val="20"/>
               </w:rPr>
-              <w:t>Tiết 67 (1 tiết)</w:t>
+              <w:t>Tiết 67 (5 tiết)</w:t>
             </w:r>
           </w:p>
         </w:tc>

</xml_diff>